<commit_message>
Grosse amelioration sur la vitesse Delete Duplicate cache & appels API optimisation generale
</commit_message>
<xml_diff>
--- a/cabinet_dentaire_back/resources/template/template_certificat.docx
+++ b/cabinet_dentaire_back/resources/template/template_certificat.docx
@@ -89,6 +89,8 @@
         </w:rPr>
         <w:t>CABINET DENTAIRE</w:t>
       </w:r>
+      <w:bookmarkStart w:id="0" w:name="_GoBack"/>
+      <w:bookmarkEnd w:id="0"/>
     </w:p>
     <w:p>
       <w:pPr>
@@ -288,8 +290,6 @@
       <w:r>
         <w:t>.</w:t>
       </w:r>
-      <w:bookmarkStart w:id="0" w:name="_GoBack"/>
-      <w:bookmarkEnd w:id="0"/>
     </w:p>
     <w:p>
       <w:pPr>

</xml_diff>